<commit_message>
Deployed 10999ff with MkDocs version: 1.6.1
</commit_message>
<xml_diff>
--- a/Buch Bayrische Nächte/Buch 7.docx
+++ b/Buch Bayrische Nächte/Buch 7.docx
@@ -4,6 +4,75 @@
   <w:body>
     <w:p>
       <w:r>
+        <w:t xml:space="preserve">Intro: </w:t>
+      </w:r>
+    </w:p>
+    <w:p>
+      <w:r>
+        <w:t>Kapitel 1</w:t>
+      </w:r>
+    </w:p>
+    <w:p>
+      <w:r>
+        <w:t>Aus der Sicht von Maximilian, als er</w:t>
+      </w:r>
+      <w:r>
+        <w:t xml:space="preserve"> und Janette</w:t>
+      </w:r>
+      <w:r>
+        <w:t xml:space="preserve"> sich vor dem Teufel versteck</w:t>
+      </w:r>
+      <w:r>
+        <w:t>en</w:t>
+      </w:r>
+      <w:r>
+        <w:t xml:space="preserve"> und die Leichen der drei Helden sieht. Er entschiedet sich seinen Plan B zu nutzen und die Zeitschleife weiter zu gehen, obwohl der Teufel dadurch vielleicht mächtiger wird. Der Teufel verspottet ihn derweil und, Janette an der Seite von ihm drücken zusammen den Schalter. </w:t>
+      </w:r>
+      <w:r>
+        <w:t>Die beiden enden in der Hölle, wo der Teufel sie begrüßt. Er hat sonst keinen Grund hier her zu kommen, aber jetzt hat er zwei. Er beginnt die beiden persönlich zu Foltern. Man sieht als letztes im Kapitel, wie die beiden sich gegenseitig die Hand halten.</w:t>
+      </w:r>
+    </w:p>
+    <w:p/>
+    <w:p>
+      <w:r>
+        <w:t>Wir erleben, wie die Helden als Seelen heilen und erfahren mehr über die Welt dahinter. Auch was vor langer Zeit mit den Seelenbändigern geschah, da die Schäferin ihnen nun alles von Angesicht zu Angesicht erzählen kann.</w:t>
+      </w:r>
+    </w:p>
+    <w:p>
+      <w:r>
+        <w:t>Ein Kapitel, wie Janette und Maximilian in der Hölle leiden und mehr über den Teufel erfahren.</w:t>
+      </w:r>
+    </w:p>
+    <w:p>
+      <w:r>
+        <w:t>Die Uhr bringt uns einige Tage bevor der Schicksalsnacht mit dem Grafen. Die Helden sind noch nicht bereit, aber Janette und Maximilian</w:t>
+      </w:r>
+      <w:r>
+        <w:t xml:space="preserve"> versuchen schlimmeres zu verhindern. Doch bringt der Teufel hier die Helden um, in dem er auch im Chalet eingeladen ist. Die Helden sterben und Janette und Maximilian sind verzweifelt.</w:t>
+      </w:r>
+    </w:p>
+    <w:p>
+      <w:r>
+        <w:t>Anna wird hier wieder von den Wardens befreit, doch hat sie die Wolfseele nicht in sich. Die Wardens bereiten sich vor, gegen der Werwolf Grafen etc. zu kämpfen.</w:t>
+      </w:r>
+    </w:p>
+    <w:p>
+      <w:r>
+        <w:t>Die Seelen der Helden kommen auf die Erde zurück und müssen das Leid anschauen, welches entstanden ist. Ihre Familien trauern und sie suchen nach jemanden, der ihnen helfen kann. Sie finden Janette und Maximilian und können in einen Körper zurückkehren, aber noch nicht ihre eigenen.</w:t>
+      </w:r>
+    </w:p>
+    <w:p>
+      <w:r>
+        <w:t>Die Helden werden stärker und stärker, während die Wardens gegen den Kult und Anhänger der Werwölfe kämpfen. Der Teufel versucht ständig den Grafen zur extremen Wut zu bringen, scheitert aber. Er muss doch an Anna ran und den Grafen töten. Am besten alles in einem, damit Anna ihrer Wut freien Lauf lässt.</w:t>
+      </w:r>
+    </w:p>
+    <w:p>
+      <w:r>
+        <w:t>Die Wardens werden bei den Kämpfen aufgerieben, bevor die Helden wieder ihre Körper erstellen können. Dabei wird Anna gefangen genommen, aber die Helden wissen von den Überlebenden, wo sie Anna und den Teufel finden können.</w:t>
+      </w:r>
+    </w:p>
+    <w:p>
+      <w:r>
         <w:t>Der Teufel wird mit H</w:t>
       </w:r>
       <w:r>
@@ -13,12 +82,25 @@
     <w:p>
       <w:pPr>
         <w:pStyle w:val="berschrift2"/>
+        <w:rPr>
+          <w:lang w:val="en-US"/>
+        </w:rPr>
       </w:pPr>
       <w:r>
+        <w:rPr>
+          <w:lang w:val="en-US"/>
+        </w:rPr>
+        <w:lastRenderedPageBreak/>
         <w:t>Epilog</w:t>
       </w:r>
     </w:p>
-    <w:p/>
+    <w:p>
+      <w:pPr>
+        <w:rPr>
+          <w:lang w:val="en-US"/>
+        </w:rPr>
+      </w:pPr>
+    </w:p>
     <w:p>
       <w:pPr>
         <w:rPr>
@@ -437,7 +519,7 @@
           <w:lang w:val="en-US" w:eastAsia="zh-CN" w:bidi="hi-IN"/>
           <w14:ligatures w14:val="none"/>
         </w:rPr>
-        <w:t xml:space="preserve"> so sure about it? The erratic chaos they had produced could lead to anything, the cycle was no more and it was sure to be more like waves crashing into cliffs over and over again. The same motion, </w:t>
+        <w:t xml:space="preserve"> so sure about it? The erratic chaos they had produced could lead to anything, the cycle was no more and it was sure to be more like waves crashing into cliffs over and over again. The same motion, the same origination of force, but a different outcome each time. Nobody could assure them their souls would stay together forever, not to be apart even in their afterlife. They wear born on the same day, the same hour, the same minute even. In the same village, in the same house, just a room apart. Ment for each other, even if they only could acknowledge that over thirty </w:t>
       </w:r>
       <w:r>
         <w:rPr>
@@ -447,7 +529,7 @@
           <w14:ligatures w14:val="none"/>
         </w:rPr>
         <w:lastRenderedPageBreak/>
-        <w:t xml:space="preserve">the same origination of force, but a different outcome each time. Nobody could assure them their souls would stay together forever, not to be apart even in their afterlife. They wear born on the same day, the same hour, the same minute even. In the same village, in the same house, just a room apart. Ment for each other, even if they only could acknowledge that over thirty years later. </w:t>
+        <w:t xml:space="preserve">years later. </w:t>
       </w:r>
       <w:r>
         <w:rPr>
@@ -756,7 +838,16 @@
           <w:lang w:val="en-US" w:eastAsia="zh-CN" w:bidi="hi-IN"/>
           <w14:ligatures w14:val="none"/>
         </w:rPr>
-        <w:t xml:space="preserve"> old protestant </w:t>
+        <w:t xml:space="preserve"> old protestant church and its small doctors house beside it. Their parents were in there around this time, their mothers laboring to give birth to them. They would not interfere here, would not try to change anything if that even was possible. A ripple now could produce a storm that they would not want to start. They stopped before the doors of the house briefly,</w:t>
+      </w:r>
+      <w:r>
+        <w:rPr>
+          <w:rFonts w:ascii="Calibri" w:eastAsia="Calibri" w:hAnsi="Calibri" w:cs="Calibri"/>
+          <w:color w:val="000000"/>
+          <w:lang w:val="en-US" w:eastAsia="zh-CN" w:bidi="hi-IN"/>
+          <w14:ligatures w14:val="none"/>
+        </w:rPr>
+        <w:t xml:space="preserve"> standing in awe and </w:t>
       </w:r>
       <w:r>
         <w:rPr>
@@ -766,16 +857,7 @@
           <w14:ligatures w14:val="none"/>
         </w:rPr>
         <w:lastRenderedPageBreak/>
-        <w:t>church and its small doctors house beside it. Their parents were in there around this time, their mothers laboring to give birth to them. They would not interfere here, would not try to change anything if that even was possible. A ripple now could produce a storm that they would not want to start. They stopped before the doors of the house briefly,</w:t>
-      </w:r>
-      <w:r>
-        <w:rPr>
-          <w:rFonts w:ascii="Calibri" w:eastAsia="Calibri" w:hAnsi="Calibri" w:cs="Calibri"/>
-          <w:color w:val="000000"/>
-          <w:lang w:val="en-US" w:eastAsia="zh-CN" w:bidi="hi-IN"/>
-          <w14:ligatures w14:val="none"/>
-        </w:rPr>
-        <w:t xml:space="preserve"> standing in awe and reverence.</w:t>
+        <w:t>reverence.</w:t>
       </w:r>
       <w:r>
         <w:rPr>
@@ -1141,7 +1223,61 @@
           <w:lang w:val="en-US" w:eastAsia="zh-CN" w:bidi="hi-IN"/>
           <w14:ligatures w14:val="none"/>
         </w:rPr>
-        <w:t xml:space="preserve">meters away in the pond two bodies were floating, one in brown leather, the other </w:t>
+        <w:t xml:space="preserve">meters away in the pond two bodies were floating, one in brown leather, the other in a red dress. A family of ducks was swimming past them, not disturbing their strange peace, as they slowly turned, fingers still clutched together in a cold embrace, never letting go. All of </w:t>
+      </w:r>
+      <w:r>
+        <w:rPr>
+          <w:rFonts w:ascii="Calibri" w:eastAsia="Calibri" w:hAnsi="Calibri" w:cs="Calibri"/>
+          <w:color w:val="000000"/>
+          <w:lang w:val="en-US" w:eastAsia="zh-CN" w:bidi="hi-IN"/>
+          <w14:ligatures w14:val="none"/>
+        </w:rPr>
+        <w:t>these strange occurrences</w:t>
+      </w:r>
+      <w:r>
+        <w:rPr>
+          <w:rFonts w:ascii="Calibri" w:eastAsia="Calibri" w:hAnsi="Calibri" w:cs="Calibri"/>
+          <w:color w:val="000000"/>
+          <w:lang w:val="en-US" w:eastAsia="zh-CN" w:bidi="hi-IN"/>
+          <w14:ligatures w14:val="none"/>
+        </w:rPr>
+        <w:t xml:space="preserve"> would later be talked about in the newspaper and the regular’s tables in the village, people wondering</w:t>
+      </w:r>
+      <w:r>
+        <w:rPr>
+          <w:rFonts w:ascii="Calibri" w:eastAsia="Calibri" w:hAnsi="Calibri" w:cs="Calibri"/>
+          <w:color w:val="000000"/>
+          <w:lang w:val="en-US" w:eastAsia="zh-CN" w:bidi="hi-IN"/>
+          <w14:ligatures w14:val="none"/>
+        </w:rPr>
+        <w:t xml:space="preserve"> and pondering</w:t>
+      </w:r>
+      <w:r>
+        <w:rPr>
+          <w:rFonts w:ascii="Calibri" w:eastAsia="Calibri" w:hAnsi="Calibri" w:cs="Calibri"/>
+          <w:color w:val="000000"/>
+          <w:lang w:val="en-US" w:eastAsia="zh-CN" w:bidi="hi-IN"/>
+          <w14:ligatures w14:val="none"/>
+        </w:rPr>
+        <w:t xml:space="preserve"> over </w:t>
+      </w:r>
+      <w:r>
+        <w:rPr>
+          <w:rFonts w:ascii="Calibri" w:eastAsia="Calibri" w:hAnsi="Calibri" w:cs="Calibri"/>
+          <w:color w:val="000000"/>
+          <w:lang w:val="en-US" w:eastAsia="zh-CN" w:bidi="hi-IN"/>
+          <w14:ligatures w14:val="none"/>
+        </w:rPr>
+        <w:t>all</w:t>
+      </w:r>
+      <w:r>
+        <w:rPr>
+          <w:rFonts w:ascii="Calibri" w:eastAsia="Calibri" w:hAnsi="Calibri" w:cs="Calibri"/>
+          <w:color w:val="000000"/>
+          <w:lang w:val="en-US" w:eastAsia="zh-CN" w:bidi="hi-IN"/>
+          <w14:ligatures w14:val="none"/>
+        </w:rPr>
+        <w:t xml:space="preserve"> those life defining events </w:t>
       </w:r>
       <w:r>
         <w:rPr>
@@ -1151,61 +1287,7 @@
           <w14:ligatures w14:val="none"/>
         </w:rPr>
         <w:lastRenderedPageBreak/>
-        <w:t xml:space="preserve">in a red dress. A family of ducks was swimming past them, not disturbing their strange peace, as they slowly turned, fingers still clutched together in a cold embrace, never letting go. All of </w:t>
-      </w:r>
-      <w:r>
-        <w:rPr>
-          <w:rFonts w:ascii="Calibri" w:eastAsia="Calibri" w:hAnsi="Calibri" w:cs="Calibri"/>
-          <w:color w:val="000000"/>
-          <w:lang w:val="en-US" w:eastAsia="zh-CN" w:bidi="hi-IN"/>
-          <w14:ligatures w14:val="none"/>
-        </w:rPr>
-        <w:t>these strange occurrences</w:t>
-      </w:r>
-      <w:r>
-        <w:rPr>
-          <w:rFonts w:ascii="Calibri" w:eastAsia="Calibri" w:hAnsi="Calibri" w:cs="Calibri"/>
-          <w:color w:val="000000"/>
-          <w:lang w:val="en-US" w:eastAsia="zh-CN" w:bidi="hi-IN"/>
-          <w14:ligatures w14:val="none"/>
-        </w:rPr>
-        <w:t xml:space="preserve"> would later be talked about in the newspaper and the regular’s tables in the village, people wondering</w:t>
-      </w:r>
-      <w:r>
-        <w:rPr>
-          <w:rFonts w:ascii="Calibri" w:eastAsia="Calibri" w:hAnsi="Calibri" w:cs="Calibri"/>
-          <w:color w:val="000000"/>
-          <w:lang w:val="en-US" w:eastAsia="zh-CN" w:bidi="hi-IN"/>
-          <w14:ligatures w14:val="none"/>
-        </w:rPr>
-        <w:t xml:space="preserve"> and pondering</w:t>
-      </w:r>
-      <w:r>
-        <w:rPr>
-          <w:rFonts w:ascii="Calibri" w:eastAsia="Calibri" w:hAnsi="Calibri" w:cs="Calibri"/>
-          <w:color w:val="000000"/>
-          <w:lang w:val="en-US" w:eastAsia="zh-CN" w:bidi="hi-IN"/>
-          <w14:ligatures w14:val="none"/>
-        </w:rPr>
-        <w:t xml:space="preserve"> over </w:t>
-      </w:r>
-      <w:r>
-        <w:rPr>
-          <w:rFonts w:ascii="Calibri" w:eastAsia="Calibri" w:hAnsi="Calibri" w:cs="Calibri"/>
-          <w:color w:val="000000"/>
-          <w:lang w:val="en-US" w:eastAsia="zh-CN" w:bidi="hi-IN"/>
-          <w14:ligatures w14:val="none"/>
-        </w:rPr>
-        <w:t>all</w:t>
-      </w:r>
-      <w:r>
-        <w:rPr>
-          <w:rFonts w:ascii="Calibri" w:eastAsia="Calibri" w:hAnsi="Calibri" w:cs="Calibri"/>
-          <w:color w:val="000000"/>
-          <w:lang w:val="en-US" w:eastAsia="zh-CN" w:bidi="hi-IN"/>
-          <w14:ligatures w14:val="none"/>
-        </w:rPr>
-        <w:t xml:space="preserve"> those life defining events happening at the same place and time, displaying a perfect circle of life and death in its whole.</w:t>
+        <w:t>happening at the same place and time, displaying a perfect circle of life and death in its whole.</w:t>
       </w:r>
       <w:r>
         <w:rPr>

</xml_diff>